<commit_message>
Codex's second round on bd50873: four open points of M1-C4, M1-C5, M1-C9
- M1-C4: the staff page shows retained thesis data (topic, proposal,
  supervisor) and every request with its answers, comments and times,
  whatever the current graduation type.
- M1-C4: a refused type change says what is wrong in the student form's
  words (mixed letters, characters by code, a choice not in the list);
  "missing" is kept for genuinely empty required fields.
- M1-C5: the first start is recorded in the database (schema 2 adds the
  installation table, keeping every row); an initialised installation whose
  lists, or whole lists folder, are missing stops without recreating them.
- M1-C9: the report's signature block, from „Приложение“ to the date, is kept
  together and the empty last paragraph is removed. Checked in Microsoft Word
  with 1, 3 and 12 invented students: the block is whole on the last page.

Co-Authored-By: Claude Opus 5.5 <noreply@anthropic.com>
</commit_message>
<xml_diff>
--- a/templates/doklad_temi.docx
+++ b/templates/doklad_temi.docx
@@ -975,6 +975,8 @@
     </w:tbl>
     <w:p>
       <w:pPr>
+        <w:keepNext/>
+        <w:keepLines/>
         <w:spacing w:after="0" w:line="240" w:lineRule="auto"/>
         <w:rPr>
           <w:rFonts w:ascii="Times New Roman" w:hAnsi="Times New Roman"/>
@@ -986,6 +988,8 @@
     </w:p>
     <w:p>
       <w:pPr>
+        <w:keepNext/>
+        <w:keepLines/>
         <w:spacing w:after="0" w:line="240" w:lineRule="auto"/>
         <w:rPr>
           <w:rFonts w:ascii="Times New Roman" w:hAnsi="Times New Roman"/>
@@ -1088,6 +1092,8 @@
     </w:p>
     <w:p>
       <w:pPr>
+        <w:keepNext/>
+        <w:keepLines/>
         <w:spacing w:after="0" w:line="240" w:lineRule="auto"/>
         <w:rPr>
           <w:rFonts w:ascii="Times New Roman" w:hAnsi="Times New Roman"/>
@@ -1267,6 +1273,8 @@
     </w:p>
     <w:p>
       <w:pPr>
+        <w:keepNext/>
+        <w:keepLines/>
         <w:spacing w:after="0" w:line="240" w:lineRule="auto"/>
         <w:rPr>
           <w:rFonts w:ascii="Times New Roman" w:hAnsi="Times New Roman"/>
@@ -1286,6 +1294,7 @@
     </w:p>
     <w:p>
       <w:pPr>
+        <w:keepLines/>
         <w:spacing w:after="0" w:line="240" w:lineRule="auto"/>
         <w:rPr>
           <w:rFonts w:ascii="Times New Roman" w:hAnsi="Times New Roman"/>
@@ -1375,7 +1384,6 @@
         <w:tab/>
       </w:r>
     </w:p>
-    <w:p/>
     <w:sectPr>
       <w:pgSz w:w="16838" w:h="11906" w:orient="landscape"/>
       <w:pgMar w:top="1417" w:right="1417" w:bottom="1417" w:left="1417" w:header="708" w:footer="708" w:gutter="0"/>

</xml_diff>

<commit_message>
Three gaps found checking 159925f, inside Codex's M1-C4 and M1-C5
- M1-C5: a database already at schema 1 is an installation: migration 2
  records it as such, so an upgraded installation with a list or its whole
  lists folder missing stops instead of recreating them. Starting lists are
  written whole or not at all, so a failed first start leaves no partial file.
- M1-C4: a typed supervisor address that is filled in but not an address is
  refused as wrong ("Това не прилича на адрес…"), not called missing, on the
  student form, choosing again, the staff supervisor change and type change.
- M1-C4: a retained supervisor title on its own is shown on the staff page.
- The report header's complex-script size follows to 12 pt as well.

Co-Authored-By: Claude Opus 5.5 <noreply@anthropic.com>
</commit_message>
<xml_diff>
--- a/templates/doklad_temi.docx
+++ b/templates/doklad_temi.docx
@@ -389,7 +389,7 @@
                 <w:rFonts w:ascii="Times New Roman" w:hAnsi="Times New Roman"/>
                 <w:b/>
                 <w:sz w:val="24"/>
-                <w:szCs w:val="20"/>
+                <w:szCs w:val="24"/>
               </w:rPr>
               <w:t>№</w:t>
             </w:r>
@@ -422,7 +422,7 @@
                 <w:rFonts w:ascii="Times New Roman" w:hAnsi="Times New Roman"/>
                 <w:b/>
                 <w:sz w:val="24"/>
-                <w:szCs w:val="20"/>
+                <w:szCs w:val="24"/>
               </w:rPr>
               <w:t>F№</w:t>
             </w:r>
@@ -455,7 +455,7 @@
                 <w:rFonts w:ascii="Times New Roman" w:hAnsi="Times New Roman"/>
                 <w:b/>
                 <w:sz w:val="24"/>
-                <w:szCs w:val="20"/>
+                <w:szCs w:val="24"/>
               </w:rPr>
               <w:t>Име</w:t>
             </w:r>
@@ -486,7 +486,7 @@
                 <w:rFonts w:ascii="Times New Roman" w:hAnsi="Times New Roman"/>
                 <w:b/>
                 <w:sz w:val="24"/>
-                <w:szCs w:val="20"/>
+                <w:szCs w:val="24"/>
               </w:rPr>
               <w:t>Тема</w:t>
             </w:r>
@@ -517,7 +517,7 @@
                 <w:rFonts w:ascii="Times New Roman" w:hAnsi="Times New Roman"/>
                 <w:b/>
                 <w:sz w:val="24"/>
-                <w:szCs w:val="20"/>
+                <w:szCs w:val="24"/>
               </w:rPr>
               <w:t>Научен ръководител</w:t>
             </w:r>
@@ -548,7 +548,7 @@
                 <w:rFonts w:ascii="Times New Roman" w:hAnsi="Times New Roman"/>
                 <w:b/>
                 <w:sz w:val="24"/>
-                <w:szCs w:val="20"/>
+                <w:szCs w:val="24"/>
               </w:rPr>
               <w:t>Рецензент</w:t>
             </w:r>

</xml_diff>